<commit_message>
PROFANE ATTACK v1.7: throw messages after every strike
Merc. hurl inv. crosses! and Satanists spew brimstones! now appear after
every strike in which crosses or brimstones were actually thrown (V, Z =
crosses, brimstones thrown), not only between ROUND1 and ROUND2.
Instructions and recording updated; 5530 bytes.

Co-Authored-By: Claude Opus 5.5 <noreply@anthropic.com>
Claude-Session: https://claude.ai/code/session_014MnrG7cc1Hws3poqmcDFnM
</commit_message>
<xml_diff>
--- a/instructions_v1.7.docx
+++ b/instructions_v1.7.docx
@@ -319,7 +319,7 @@
         <w:rPr>
           <w:lang w:val="en-GB"/>
         </w:rPr>
-        <w:t xml:space="preserve"> with a RAM module (CE-151 or larger). The recording holds the program without its REM lines (5532 bytes); with its variables it needs about 5.9 KB of memory, so it does not fit into a PC-1500 or PC-2 without a module.</w:t>
+        <w:t xml:space="preserve"> with a RAM module (CE-151 or larger). The recording holds the program without its REM lines (5530 bytes); with its variables it needs about 5.9 KB of memory, so it does not fit into a PC-1500 or PC-2 without a module.</w:t>
       </w:r>
     </w:p>
     <w:p>
@@ -3910,59 +3910,33 @@
         <w:rPr>
           <w:lang w:val="en-GB"/>
         </w:rPr>
-        <w:t xml:space="preserve"> when you lose. Between </w:t>
+        <w:t xml:space="preserve"> when you lose. After every strike in which your mercenaries hurl crosses, the game shows </w:t>
       </w:r>
       <w:r>
         <w:rPr>
           <w:rFonts w:ascii="Courier New" w:eastAsia="Courier New" w:hAnsi="Courier New" w:cs="Courier New"/>
           <w:lang w:val="en-GB"/>
         </w:rPr>
-        <w:t>ROUND1</w:t>
-      </w:r>
-      <w:r>
-        <w:rPr>
-          <w:lang w:val="en-GB"/>
-        </w:rPr>
-        <w:t xml:space="preserve"> and </w:t>
+        <w:t>Merc. hurl inv. crosses!</w:t>
+      </w:r>
+      <w:r>
+        <w:rPr>
+          <w:lang w:val="en-GB"/>
+        </w:rPr>
+        <w:t xml:space="preserve">, and after every strike in which your Satanists spew brimstones, it shows </w:t>
       </w:r>
       <w:r>
         <w:rPr>
           <w:rFonts w:ascii="Courier New" w:eastAsia="Courier New" w:hAnsi="Courier New" w:cs="Courier New"/>
           <w:lang w:val="en-GB"/>
         </w:rPr>
-        <w:t>ROUND2</w:t>
-      </w:r>
-      <w:r>
-        <w:rPr>
-          <w:lang w:val="en-GB"/>
-        </w:rPr>
-        <w:t xml:space="preserve"> the game shows </w:t>
-      </w:r>
-      <w:r>
-        <w:rPr>
-          <w:rFonts w:ascii="Courier New" w:eastAsia="Courier New" w:hAnsi="Courier New" w:cs="Courier New"/>
-          <w:lang w:val="en-GB"/>
-        </w:rPr>
-        <w:t>Merc. hurl inv. crosses!</w:t>
-      </w:r>
-      <w:r>
-        <w:rPr>
-          <w:lang w:val="en-GB"/>
-        </w:rPr>
-        <w:t xml:space="preserve"> when you fight with crosses and </w:t>
-      </w:r>
-      <w:r>
-        <w:rPr>
-          <w:rFonts w:ascii="Courier New" w:eastAsia="Courier New" w:hAnsi="Courier New" w:cs="Courier New"/>
-          <w:lang w:val="en-GB"/>
-        </w:rPr>
         <w:t>Satanists spew brimstones!</w:t>
       </w:r>
       <w:r>
         <w:rPr>
           <w:lang w:val="en-GB"/>
         </w:rPr>
-        <w:t xml:space="preserve"> when you fight with brimstones.</w:t>
+        <w:t xml:space="preserve">, before the next round.</w:t>
       </w:r>
     </w:p>
     <w:p>

</xml_diff>

<commit_message>
PROFANE ATTACK v1.7: "Jihadists attack!", YOU WON! (place), inverted crosses
- Every round in which jihadists strike now shows "Jihadists attack!"
  after the crosses and brimstones messages (line 324; S = jihadists in
  the strike).
- The scrolling "YOU WON! <place> IS YOURS" line is replaced by a fixed
  "YOU WON! (Loreto)" with the melody, held about 1.5 s. This frees
  memory: 5480 bytes without REMs, 88 bytes spare.
- Line 322 reads "Mercenaries hurl crosses!" (the GitHub edit had the
  typo "Merceries"); line 340 keeps the "INV.CROSSES" edit.
- README and instructions: inverted crosses are deeply terrifying to the
  devout and the clergy, and lethal to their very souls; the new
  messages and the new size. WAV rebuilt and decoded back.

Co-Authored-By: Claude Opus 5.5 <noreply@anthropic.com>
Claude-Session: https://claude.ai/code/session_014MnrG7cc1Hws3poqmcDFnM
</commit_message>
<xml_diff>
--- a/instructions_v1.7.docx
+++ b/instructions_v1.7.docx
@@ -319,7 +319,7 @@
         <w:rPr>
           <w:lang w:val="en-GB"/>
         </w:rPr>
-        <w:t xml:space="preserve"> with a RAM module (CE-151 or larger). The recording holds the program without its REM lines (5530 bytes); with its variables it needs about 5.9 KB of memory, so it does not fit into a PC-1500 or PC-2 without a module.</w:t>
+        <w:t xml:space="preserve"> with a RAM module (CE-151 or larger). The recording holds the program without its REM lines (5480 bytes); with its variables it needs about 5.9 KB of memory, so it does not fit into a PC-1500 or PC-2 without a module.</w:t>
       </w:r>
     </w:p>
     <w:p>
@@ -1745,7 +1745,7 @@
         <w:rPr>
           <w:lang w:val="en-GB"/>
         </w:rPr>
-        <w:t xml:space="preserve"> instils terror among Cathodics. Only mercenaries can hurl inverted crosses, each mercenary one cross per round. A cross that hits eliminates one fighter in that round.</w:t>
+        <w:t xml:space="preserve"> as everyone knows, inverted crosses are deeply terrifying to the devout and the clergy, and lethal to their very souls. Only mercenaries can hurl inverted crosses, each mercenary one cross per round. A cross that hits eliminates one fighter in that round.</w:t>
       </w:r>
     </w:p>
     <w:p>
@@ -3917,7 +3917,7 @@
           <w:rFonts w:ascii="Courier New" w:eastAsia="Courier New" w:hAnsi="Courier New" w:cs="Courier New"/>
           <w:lang w:val="en-GB"/>
         </w:rPr>
-        <w:t>Merc. hurl inv. crosses!</w:t>
+        <w:t>Mercenaries hurl crosses!</w:t>
       </w:r>
       <w:r>
         <w:rPr>
@@ -3936,6 +3936,19 @@
         <w:rPr>
           <w:lang w:val="en-GB"/>
         </w:rPr>
+        <w:t xml:space="preserve">, and after every strike in which your jihadists attack, it shows </w:t>
+      </w:r>
+      <w:r>
+        <w:rPr>
+          <w:rFonts w:ascii="Courier New" w:eastAsia="Courier New" w:hAnsi="Courier New" w:cs="Courier New"/>
+          <w:lang w:val="en-GB"/>
+        </w:rPr>
+        <w:t>Jihadists attack!</w:t>
+      </w:r>
+      <w:r>
+        <w:rPr>
+          <w:lang w:val="en-GB"/>
+        </w:rPr>
         <w:t xml:space="preserve">, before the next round.</w:t>
       </w:r>
     </w:p>
@@ -3985,13 +3998,13 @@
           <w:rFonts w:ascii="Courier New" w:eastAsia="Courier New" w:hAnsi="Courier New" w:cs="Courier New"/>
           <w:lang w:val="en-GB"/>
         </w:rPr>
-        <w:t>YOU WON! Lourdes IS YOURS</w:t>
-      </w:r>
-      <w:r>
-        <w:rPr>
-          <w:lang w:val="en-GB"/>
-        </w:rPr>
-        <w:t xml:space="preserve">. A longer place name does not fit on the display, so after the melody the line moves to the left until you can read its end. The line stays about 1.5 seconds after the melody, and the next screens follow by themselves, about 1.5 seconds each:</w:t>
+        <w:t>YOU WON! (Lourdes)</w:t>
+      </w:r>
+      <w:r>
+        <w:rPr>
+          <w:lang w:val="en-GB"/>
+        </w:rPr>
+        <w:t xml:space="preserve">. The line stays about 1.5 seconds after the melody, and the next screens follow by themselves, about 1.5 seconds each:</w:t>
       </w:r>
     </w:p>
     <w:p>
@@ -4023,7 +4036,7 @@
           <w:rFonts w:ascii="Courier New" w:eastAsia="Courier New" w:hAnsi="Courier New" w:cs="Courier New"/>
           <w:lang w:val="en-GB"/>
         </w:rPr>
-        <w:t>r RELICS c CROSSES</w:t>
+        <w:t>r RELICS c INV.CROSSES</w:t>
       </w:r>
     </w:p>
     <w:p>

</xml_diff>

<commit_message>
PROFANE ATTACK v1.7: treasure shown at the end of the win summary
After a won fight the screens now come in this order: YOU WON! (place),
gold, relics and inverted crosses, your losses, new mercenaries and
Satanists, and last AND ALSO YOU GOT: with the treasure of the place
(lines 360-365). Instructions and WAV updated.

Co-Authored-By: Claude Opus 5.5 <noreply@anthropic.com>
Claude-Session: https://claude.ai/code/session_014MnrG7cc1Hws3poqmcDFnM
</commit_message>
<xml_diff>
--- a/instructions_v1.7.docx
+++ b/instructions_v1.7.docx
@@ -4062,12 +4062,16 @@
       <w:pPr>
         <w:spacing w:after="40"/>
         <w:ind w:left="567"/>
+        <w:rPr>
+          <w:lang w:val="en-GB"/>
+        </w:rPr>
       </w:pPr>
       <w:r>
         <w:rPr>
           <w:rFonts w:ascii="Courier New" w:eastAsia="Courier New" w:hAnsi="Courier New" w:cs="Courier New"/>
-        </w:rPr>
-        <w:t>AND ALSO YOU GOT:</w:t>
+          <w:lang w:val="en-GB"/>
+        </w:rPr>
+        <w:t>LOST: m MERC s SAT j JIH</w:t>
       </w:r>
     </w:p>
     <w:p>
@@ -4086,20 +4090,7 @@
         <w:rPr>
           <w:lang w:val="en-GB"/>
         </w:rPr>
-        <w:t xml:space="preserve">Then the treasure of the place, e.g. </w:t>
-      </w:r>
-      <w:r>
-        <w:rPr>
-          <w:rFonts w:ascii="Courier New" w:eastAsia="Courier New" w:hAnsi="Courier New" w:cs="Courier New"/>
-          <w:lang w:val="en-GB"/>
-        </w:rPr>
-        <w:t>barrel of Holy Water</w:t>
-      </w:r>
-      <w:r>
-        <w:rPr>
-          <w:lang w:val="en-GB"/>
-        </w:rPr>
-        <w:t xml:space="preserve"> at Lourdes. Every place has its own treasure; it is a trophy and does not change your resources. You get it only the first time you conquer the place: when you win back a place that broke free, this screen is left out.</w:t>
+        <w:t>Your human losses in this fight.</w:t>
       </w:r>
     </w:p>
     <w:p>
@@ -4115,7 +4106,7 @@
           <w:rFonts w:ascii="Courier New" w:eastAsia="Courier New" w:hAnsi="Courier New" w:cs="Courier New"/>
           <w:lang w:val="en-GB"/>
         </w:rPr>
-        <w:t>LOST: m MERC s SAT j JIH</w:t>
+        <w:t>GOT y NEW MERC, z SAT</w:t>
       </w:r>
     </w:p>
     <w:p>
@@ -4134,23 +4125,19 @@
         <w:rPr>
           <w:lang w:val="en-GB"/>
         </w:rPr>
-        <w:t>Your human losses in this fight.</w:t>
+        <w:t xml:space="preserve">A sixth of the militants of the place join you as mercenaries. The more gold a place gives you, the more new Satanists join you, because Cathodic people were outraged by how much gold was stored there.</w:t>
       </w:r>
     </w:p>
     <w:p>
       <w:pPr>
         <w:spacing w:after="40"/>
         <w:ind w:left="567"/>
-        <w:rPr>
-          <w:lang w:val="en-GB"/>
-        </w:rPr>
       </w:pPr>
       <w:r>
         <w:rPr>
           <w:rFonts w:ascii="Courier New" w:eastAsia="Courier New" w:hAnsi="Courier New" w:cs="Courier New"/>
-          <w:lang w:val="en-GB"/>
-        </w:rPr>
-        <w:t>GOT y NEW MERC, z SAT</w:t>
+        </w:rPr>
+        <w:t>AND ALSO YOU GOT:</w:t>
       </w:r>
     </w:p>
     <w:p>
@@ -4169,7 +4156,20 @@
         <w:rPr>
           <w:lang w:val="en-GB"/>
         </w:rPr>
-        <w:t xml:space="preserve">A sixth of the militants of the place join you as mercenaries. The more gold a place gives you, the more new Satanists join you, because Cathodic people were outraged by how much gold was stored there.</w:t>
+        <w:t xml:space="preserve">Last, the treasure of the place, e.g. </w:t>
+      </w:r>
+      <w:r>
+        <w:rPr>
+          <w:rFonts w:ascii="Courier New" w:eastAsia="Courier New" w:hAnsi="Courier New" w:cs="Courier New"/>
+          <w:lang w:val="en-GB"/>
+        </w:rPr>
+        <w:t>barrel of Holy Water</w:t>
+      </w:r>
+      <w:r>
+        <w:rPr>
+          <w:lang w:val="en-GB"/>
+        </w:rPr>
+        <w:t xml:space="preserve"> at Lourdes. Every place has its own treasure; it is a trophy and does not change your resources. You get it only the first time you conquer the place: when you win back a place that broke free, this screen is left out.</w:t>
       </w:r>
     </w:p>
     <w:p>

</xml_diff>